<commit_message>
Make retros and Marginal Gains single cadence-neutral boards
- One board per retro format and one Marginal Gains board, with a
  write-in period on the actions strip (sprint, month, quarter…)
- Old -sprint / -quarter pages become redirects; duplicate SVGs removed
- "Iteration" instead of "sprint" on non-Scrum boards; guides, home
  page, cheat sheet, role page, README and CLAUDE.md updated

Co-Authored-By: Claude Opus 5.5 <noreply@anthropic.com>
</commit_message>
<xml_diff>
--- a/facilitator-guide-retro-4ls.docx
+++ b/facilitator-guide-retro-4ls.docx
@@ -199,25 +199,7 @@
         </w:numPr>
       </w:pPr>
       <w:r>
-        <w:t xml:space="preserve">Pick the </w:t>
-      </w:r>
-      <w:r>
-        <w:rPr>
-          <w:b/>
-        </w:rPr>
-        <w:t xml:space="preserve">sprint</w:t>
-      </w:r>
-      <w:r>
-        <w:t xml:space="preserve"> board (60 min) or </w:t>
-      </w:r>
-      <w:r>
-        <w:rPr>
-          <w:b/>
-        </w:rPr>
-        <w:t xml:space="preserve">quarter</w:t>
-      </w:r>
-      <w:r>
-        <w:t xml:space="preserve"> board (2 h) and print at A3, or load the SVG into Miro / Mural / FigJam</w:t>
+        <w:t xml:space="preserve">Print the board at A3, or load the SVG into Miro / Mural / FigJam. Write the period on the actions strip (sprint, month or quarter); allow about 60 min for a sprint and 2 h for a quarter</w:t>
       </w:r>
     </w:p>
     <w:p>
@@ -1092,7 +1074,7 @@
         <w:pStyle w:val="Small"/>
       </w:pPr>
       <w:r>
-        <w:t xml:space="preserve">Boards: https://eparker71.github.io/agile-ways-of-working/retro-board-4ls-sprint.html  ·  Online guide: https://eparker71.github.io/agile-ways-of-working/facilitator-guide-retro-4ls.html</w:t>
+        <w:t xml:space="preserve">Boards: https://eparker71.github.io/agile-ways-of-working/retro-board-4ls.html  ·  Online guide: https://eparker71.github.io/agile-ways-of-working/facilitator-guide-retro-4ls.html</w:t>
       </w:r>
     </w:p>
     <w:p>

</xml_diff>